<commit_message>
File 9 newly downloaded references and relink plan-2
- Rename and file the PDFs uploaded to Plan_fen/External References
  (one duplicate of the filed Luo et al. 2025 review dropped) and remove
  the staging folder
- Drop the "Frontiers -" prefix from Luo et al. (2019) so plan-2 links
  to the local PDF
- plan-2: 70 of 76 references now link to local PDFs; Kilwinger & van
  Dam pages confirmed; three more review candidates marked downloaded
- Download list: 6 references still missing, 1 preprint to replace
- Replace the folder-count record with 1024-0025 (246 PDFs, +9)

Co-Authored-By: Claude Opus 5.5 <noreply@anthropic.com>
Claude-Session: https://claude.ai/code/session_016FPnR4vKwrHGHQQfjHQt5q
</commit_message>
<xml_diff>
--- a/Plan_fen/plan-2/plan-2_待下載文獻清單.docx
+++ b/Plan_fen/plan-2/plan-2_待下載文獻清單.docx
@@ -26,7 +26,7 @@
           <w:sz w:val="21"/>
           <w:szCs w:val="21"/>
         </w:rPr>
-        <w:t xml:space="preserve">計畫書「plan-2_兩年期研究計畫書.docx」參考文獻共 76 篇，其中 63 篇已存放於主題資料夾，13 篇尚未取得。書目資料已以網路檢索比對出版社頁面、RePEc／大學典藏或期刊新聞稿（本工作環境無法連線 Crossref 與 doi.org）；標示「待核對」者，請於下載時以出版社頁面確認後告知，以便更新計畫書。下載後放進 External References 資料夾即可，之後重新產出計畫書時，引用超連結會改連到本地 PDF。</w:t>
+        <w:t xml:space="preserve">計畫書「plan-2_兩年期研究計畫書.docx」參考文獻共 76 篇，其中 70 篇已存放於主題資料夾，6 篇尚未取得。書目資料已以網路檢索比對出版社頁面、RePEc／大學典藏或期刊新聞稿（本工作環境無法連線 Crossref 與 doi.org）；標示「待核對」者，請於下載時以出版社頁面確認後告知，以便更新計畫書。下載後放進 External References 資料夾即可，之後重新產出計畫書時，引用超連結會改連到本地 PDF。</w:t>
       </w:r>
     </w:p>
     <w:p>
@@ -40,7 +40,7 @@
           <w:sz w:val="26"/>
           <w:szCs w:val="26"/>
         </w:rPr>
-        <w:t xml:space="preserve">一、plan-2 引用、尚未取得的文獻（13 篇）</w:t>
+        <w:t xml:space="preserve">一、plan-2 引用、尚未取得的文獻（6 篇）</w:t>
       </w:r>
     </w:p>
     <w:p>
@@ -262,7 +262,7 @@
             <w:pPr>
               <w:spacing w:after="0"/>
             </w:pPr>
-            <w:hyperlink r:id="rId24">
+            <w:hyperlink r:id="rId17">
               <w:r>
                 <w:rPr>
                   <w:rFonts w:ascii="Calibri" w:hAnsi="Calibri" w:eastAsia="Microsoft JhengHei"/>
@@ -310,7 +310,7 @@
                 <w:sz w:val="17"/>
                 <w:szCs w:val="17"/>
               </w:rPr>
-              <w:t xml:space="preserve">Franke, Groeppel-Klein &amp; Müller (2023). Consumers' responses to virtual influencers as advertising endorsers: Novel and effective or uncanny and deceiving?</w:t>
+              <w:t xml:space="preserve">Gnewuch, Morana, Hinz, Kellner &amp; Maedche (2024). More than a bot? The impact of disclosing human involvement on customer interactions with hybrid service agents</w:t>
             </w:r>
           </w:p>
         </w:tc>
@@ -328,7 +328,7 @@
                 <w:sz w:val="17"/>
                 <w:szCs w:val="17"/>
               </w:rPr>
-              <w:t xml:space="preserve">Journal of Advertising（B 級）</w:t>
+              <w:t xml:space="preserve">Information Systems Research（A 級，FT50）</w:t>
             </w:r>
           </w:p>
         </w:tc>
@@ -358,103 +358,7 @@
             <w:pPr>
               <w:spacing w:after="0"/>
             </w:pPr>
-            <w:hyperlink r:id="rId25">
-              <w:r>
-                <w:rPr>
-                  <w:rFonts w:ascii="Calibri" w:hAnsi="Calibri" w:eastAsia="Microsoft JhengHei"/>
-                  <w:color w:val="0563C1"/>
-                  <w:sz w:val="17"/>
-                  <w:szCs w:val="17"/>
-                  <w:u w:val="single"/>
-                </w:rPr>
-                <w:t xml:space="preserve">https://doi.org/10.1080/00913367.2022.2154721</w:t>
-              </w:r>
-            </w:hyperlink>
-          </w:p>
-        </w:tc>
-      </w:tr>
-      <w:tr>
-        <w:tc>
-          <w:tcPr>
-            <w:tcW w:w="450" w:type="dxa"/>
-          </w:tcPr>
-          <w:p>
-            <w:pPr>
-              <w:spacing w:after="0"/>
-            </w:pPr>
-            <w:r>
-              <w:rPr>
-                <w:rFonts w:ascii="Calibri" w:hAnsi="Calibri" w:eastAsia="Microsoft JhengHei"/>
-                <w:sz w:val="17"/>
-                <w:szCs w:val="17"/>
-              </w:rPr>
-              <w:t xml:space="preserve">3</w:t>
-            </w:r>
-          </w:p>
-        </w:tc>
-        <w:tc>
-          <w:tcPr>
-            <w:tcW w:w="5900" w:type="dxa"/>
-          </w:tcPr>
-          <w:p>
-            <w:pPr>
-              <w:spacing w:after="0"/>
-            </w:pPr>
-            <w:r>
-              <w:rPr>
-                <w:rFonts w:ascii="Calibri" w:hAnsi="Calibri" w:eastAsia="Microsoft JhengHei"/>
-                <w:sz w:val="17"/>
-                <w:szCs w:val="17"/>
-              </w:rPr>
-              <w:t xml:space="preserve">Gnewuch, Morana, Hinz, Kellner &amp; Maedche (2024). More than a bot? The impact of disclosing human involvement on customer interactions with hybrid service agents</w:t>
-            </w:r>
-          </w:p>
-        </w:tc>
-        <w:tc>
-          <w:tcPr>
-            <w:tcW w:w="2700" w:type="dxa"/>
-          </w:tcPr>
-          <w:p>
-            <w:pPr>
-              <w:spacing w:after="0"/>
-            </w:pPr>
-            <w:r>
-              <w:rPr>
-                <w:rFonts w:ascii="Calibri" w:hAnsi="Calibri" w:eastAsia="Microsoft JhengHei"/>
-                <w:sz w:val="17"/>
-                <w:szCs w:val="17"/>
-              </w:rPr>
-              <w:t xml:space="preserve">Information Systems Research（A 級，FT50）</w:t>
-            </w:r>
-          </w:p>
-        </w:tc>
-        <w:tc>
-          <w:tcPr>
-            <w:tcW w:w="800" w:type="dxa"/>
-          </w:tcPr>
-          <w:p>
-            <w:pPr>
-              <w:spacing w:after="0"/>
-            </w:pPr>
-            <w:r>
-              <w:rPr>
-                <w:rFonts w:ascii="Calibri" w:hAnsi="Calibri" w:eastAsia="Microsoft JhengHei"/>
-                <w:sz w:val="17"/>
-                <w:szCs w:val="17"/>
-              </w:rPr>
-              <w:t xml:space="preserve">二</w:t>
-            </w:r>
-          </w:p>
-        </w:tc>
-        <w:tc>
-          <w:tcPr>
-            <w:tcW w:w="3950" w:type="dxa"/>
-          </w:tcPr>
-          <w:p>
-            <w:pPr>
-              <w:spacing w:after="0"/>
-            </w:pPr>
-            <w:hyperlink r:id="rId26">
+            <w:hyperlink r:id="rId18">
               <w:r>
                 <w:rPr>
                   <w:rFonts w:ascii="Calibri" w:hAnsi="Calibri" w:eastAsia="Microsoft JhengHei"/>
@@ -484,7 +388,7 @@
                 <w:sz w:val="17"/>
                 <w:szCs w:val="17"/>
               </w:rPr>
-              <w:t xml:space="preserve">4</w:t>
+              <w:t xml:space="preserve">3</w:t>
             </w:r>
           </w:p>
         </w:tc>
@@ -550,7 +454,7 @@
             <w:pPr>
               <w:spacing w:after="0"/>
             </w:pPr>
-            <w:hyperlink r:id="rId27">
+            <w:hyperlink r:id="rId19">
               <w:r>
                 <w:rPr>
                   <w:rFonts w:ascii="Calibri" w:hAnsi="Calibri" w:eastAsia="Microsoft JhengHei"/>
@@ -580,7 +484,7 @@
                 <w:sz w:val="17"/>
                 <w:szCs w:val="17"/>
               </w:rPr>
-              <w:t xml:space="preserve">5</w:t>
+              <w:t xml:space="preserve">4</w:t>
             </w:r>
           </w:p>
         </w:tc>
@@ -598,7 +502,7 @@
                 <w:sz w:val="17"/>
                 <w:szCs w:val="17"/>
               </w:rPr>
-              <w:t xml:space="preserve">Luo, Tong, Fang &amp; Qu (2019). Frontiers: Machines vs. humans: The impact of artificial intelligence chatbot disclosure on customer purchases</w:t>
+              <w:t xml:space="preserve">Oliver (1980). A cognitive model of the antecedents and consequences of satisfaction decisions</w:t>
             </w:r>
           </w:p>
         </w:tc>
@@ -616,7 +520,7 @@
                 <w:sz w:val="17"/>
                 <w:szCs w:val="17"/>
               </w:rPr>
-              <w:t xml:space="preserve">Marketing Science（理論基礎）</w:t>
+              <w:t xml:space="preserve">Journal of Marketing Research（理論基礎）</w:t>
             </w:r>
           </w:p>
         </w:tc>
@@ -634,7 +538,7 @@
                 <w:sz w:val="17"/>
                 <w:szCs w:val="17"/>
               </w:rPr>
-              <w:t xml:space="preserve">二</w:t>
+              <w:t xml:space="preserve">三</w:t>
             </w:r>
           </w:p>
         </w:tc>
@@ -646,583 +550,7 @@
             <w:pPr>
               <w:spacing w:after="0"/>
             </w:pPr>
-            <w:hyperlink r:id="rId28">
-              <w:r>
-                <w:rPr>
-                  <w:rFonts w:ascii="Calibri" w:hAnsi="Calibri" w:eastAsia="Microsoft JhengHei"/>
-                  <w:color w:val="0563C1"/>
-                  <w:sz w:val="17"/>
-                  <w:szCs w:val="17"/>
-                  <w:u w:val="single"/>
-                </w:rPr>
-                <w:t xml:space="preserve">https://doi.org/10.1287/mksc.2019.1192</w:t>
-              </w:r>
-            </w:hyperlink>
-          </w:p>
-        </w:tc>
-      </w:tr>
-      <w:tr>
-        <w:tc>
-          <w:tcPr>
-            <w:tcW w:w="450" w:type="dxa"/>
-          </w:tcPr>
-          <w:p>
-            <w:pPr>
-              <w:spacing w:after="0"/>
-            </w:pPr>
-            <w:r>
-              <w:rPr>
-                <w:rFonts w:ascii="Calibri" w:hAnsi="Calibri" w:eastAsia="Microsoft JhengHei"/>
-                <w:sz w:val="17"/>
-                <w:szCs w:val="17"/>
-              </w:rPr>
-              <w:t xml:space="preserve">6</w:t>
-            </w:r>
-          </w:p>
-        </w:tc>
-        <w:tc>
-          <w:tcPr>
-            <w:tcW w:w="5900" w:type="dxa"/>
-          </w:tcPr>
-          <w:p>
-            <w:pPr>
-              <w:spacing w:after="0"/>
-            </w:pPr>
-            <w:r>
-              <w:rPr>
-                <w:rFonts w:ascii="Calibri" w:hAnsi="Calibri" w:eastAsia="Microsoft JhengHei"/>
-                <w:sz w:val="17"/>
-                <w:szCs w:val="17"/>
-              </w:rPr>
-              <w:t xml:space="preserve">Huang &amp; Rust (2021). A strategic framework for artificial intelligence in marketing</w:t>
-            </w:r>
-          </w:p>
-        </w:tc>
-        <w:tc>
-          <w:tcPr>
-            <w:tcW w:w="2700" w:type="dxa"/>
-          </w:tcPr>
-          <w:p>
-            <w:pPr>
-              <w:spacing w:after="0"/>
-            </w:pPr>
-            <w:r>
-              <w:rPr>
-                <w:rFonts w:ascii="Calibri" w:hAnsi="Calibri" w:eastAsia="Microsoft JhengHei"/>
-                <w:sz w:val="17"/>
-                <w:szCs w:val="17"/>
-              </w:rPr>
-              <w:t xml:space="preserve">Journal of the Academy of Marketing Science（A 級，FT50）</w:t>
-            </w:r>
-          </w:p>
-        </w:tc>
-        <w:tc>
-          <w:tcPr>
-            <w:tcW w:w="800" w:type="dxa"/>
-          </w:tcPr>
-          <w:p>
-            <w:pPr>
-              <w:spacing w:after="0"/>
-            </w:pPr>
-            <w:r>
-              <w:rPr>
-                <w:rFonts w:ascii="Calibri" w:hAnsi="Calibri" w:eastAsia="Microsoft JhengHei"/>
-                <w:sz w:val="17"/>
-                <w:szCs w:val="17"/>
-              </w:rPr>
-              <w:t xml:space="preserve">一</w:t>
-            </w:r>
-          </w:p>
-        </w:tc>
-        <w:tc>
-          <w:tcPr>
-            <w:tcW w:w="3950" w:type="dxa"/>
-          </w:tcPr>
-          <w:p>
-            <w:pPr>
-              <w:spacing w:after="0"/>
-            </w:pPr>
-            <w:hyperlink r:id="rId29">
-              <w:r>
-                <w:rPr>
-                  <w:rFonts w:ascii="Calibri" w:hAnsi="Calibri" w:eastAsia="Microsoft JhengHei"/>
-                  <w:color w:val="0563C1"/>
-                  <w:sz w:val="17"/>
-                  <w:szCs w:val="17"/>
-                  <w:u w:val="single"/>
-                </w:rPr>
-                <w:t xml:space="preserve">https://doi.org/10.1007/s11747-020-00749-9</w:t>
-              </w:r>
-            </w:hyperlink>
-          </w:p>
-        </w:tc>
-      </w:tr>
-      <w:tr>
-        <w:tc>
-          <w:tcPr>
-            <w:tcW w:w="450" w:type="dxa"/>
-          </w:tcPr>
-          <w:p>
-            <w:pPr>
-              <w:spacing w:after="0"/>
-            </w:pPr>
-            <w:r>
-              <w:rPr>
-                <w:rFonts w:ascii="Calibri" w:hAnsi="Calibri" w:eastAsia="Microsoft JhengHei"/>
-                <w:sz w:val="17"/>
-                <w:szCs w:val="17"/>
-              </w:rPr>
-              <w:t xml:space="preserve">7</w:t>
-            </w:r>
-          </w:p>
-        </w:tc>
-        <w:tc>
-          <w:tcPr>
-            <w:tcW w:w="5900" w:type="dxa"/>
-          </w:tcPr>
-          <w:p>
-            <w:pPr>
-              <w:spacing w:after="0"/>
-            </w:pPr>
-            <w:r>
-              <w:rPr>
-                <w:rFonts w:ascii="Calibri" w:hAnsi="Calibri" w:eastAsia="Microsoft JhengHei"/>
-                <w:sz w:val="17"/>
-                <w:szCs w:val="17"/>
-              </w:rPr>
-              <w:t xml:space="preserve">Blut, Wang, Wünderlich &amp; Brock (2021). Understanding anthropomorphism in service provision: A meta-analysis of physical robots, chatbots, and other AI</w:t>
-            </w:r>
-          </w:p>
-        </w:tc>
-        <w:tc>
-          <w:tcPr>
-            <w:tcW w:w="2700" w:type="dxa"/>
-          </w:tcPr>
-          <w:p>
-            <w:pPr>
-              <w:spacing w:after="0"/>
-            </w:pPr>
-            <w:r>
-              <w:rPr>
-                <w:rFonts w:ascii="Calibri" w:hAnsi="Calibri" w:eastAsia="Microsoft JhengHei"/>
-                <w:sz w:val="17"/>
-                <w:szCs w:val="17"/>
-              </w:rPr>
-              <w:t xml:space="preserve">Journal of the Academy of Marketing Science（A 級，FT50）</w:t>
-            </w:r>
-          </w:p>
-        </w:tc>
-        <w:tc>
-          <w:tcPr>
-            <w:tcW w:w="800" w:type="dxa"/>
-          </w:tcPr>
-          <w:p>
-            <w:pPr>
-              <w:spacing w:after="0"/>
-            </w:pPr>
-            <w:r>
-              <w:rPr>
-                <w:rFonts w:ascii="Calibri" w:hAnsi="Calibri" w:eastAsia="Microsoft JhengHei"/>
-                <w:sz w:val="17"/>
-                <w:szCs w:val="17"/>
-              </w:rPr>
-              <w:t xml:space="preserve">三</w:t>
-            </w:r>
-          </w:p>
-        </w:tc>
-        <w:tc>
-          <w:tcPr>
-            <w:tcW w:w="3950" w:type="dxa"/>
-          </w:tcPr>
-          <w:p>
-            <w:pPr>
-              <w:spacing w:after="0"/>
-            </w:pPr>
-            <w:hyperlink r:id="rId30">
-              <w:r>
-                <w:rPr>
-                  <w:rFonts w:ascii="Calibri" w:hAnsi="Calibri" w:eastAsia="Microsoft JhengHei"/>
-                  <w:color w:val="0563C1"/>
-                  <w:sz w:val="17"/>
-                  <w:szCs w:val="17"/>
-                  <w:u w:val="single"/>
-                </w:rPr>
-                <w:t xml:space="preserve">https://doi.org/10.1007/s11747-020-00762-y</w:t>
-              </w:r>
-            </w:hyperlink>
-          </w:p>
-        </w:tc>
-      </w:tr>
-      <w:tr>
-        <w:tc>
-          <w:tcPr>
-            <w:tcW w:w="450" w:type="dxa"/>
-          </w:tcPr>
-          <w:p>
-            <w:pPr>
-              <w:spacing w:after="0"/>
-            </w:pPr>
-            <w:r>
-              <w:rPr>
-                <w:rFonts w:ascii="Calibri" w:hAnsi="Calibri" w:eastAsia="Microsoft JhengHei"/>
-                <w:sz w:val="17"/>
-                <w:szCs w:val="17"/>
-              </w:rPr>
-              <w:t xml:space="preserve">8</w:t>
-            </w:r>
-          </w:p>
-        </w:tc>
-        <w:tc>
-          <w:tcPr>
-            <w:tcW w:w="5900" w:type="dxa"/>
-          </w:tcPr>
-          <w:p>
-            <w:pPr>
-              <w:spacing w:after="0"/>
-            </w:pPr>
-            <w:r>
-              <w:rPr>
-                <w:rFonts w:ascii="Calibri" w:hAnsi="Calibri" w:eastAsia="Microsoft JhengHei"/>
-                <w:sz w:val="17"/>
-                <w:szCs w:val="17"/>
-              </w:rPr>
-              <w:t xml:space="preserve">Holthöwer &amp; van Doorn (2023). Robots do not judge: Service robots can alleviate embarrassment in service encounters</w:t>
-            </w:r>
-          </w:p>
-        </w:tc>
-        <w:tc>
-          <w:tcPr>
-            <w:tcW w:w="2700" w:type="dxa"/>
-          </w:tcPr>
-          <w:p>
-            <w:pPr>
-              <w:spacing w:after="0"/>
-            </w:pPr>
-            <w:r>
-              <w:rPr>
-                <w:rFonts w:ascii="Calibri" w:hAnsi="Calibri" w:eastAsia="Microsoft JhengHei"/>
-                <w:sz w:val="17"/>
-                <w:szCs w:val="17"/>
-              </w:rPr>
-              <w:t xml:space="preserve">Journal of the Academy of Marketing Science（A 級，FT50）</w:t>
-            </w:r>
-          </w:p>
-        </w:tc>
-        <w:tc>
-          <w:tcPr>
-            <w:tcW w:w="800" w:type="dxa"/>
-          </w:tcPr>
-          <w:p>
-            <w:pPr>
-              <w:spacing w:after="0"/>
-            </w:pPr>
-            <w:r>
-              <w:rPr>
-                <w:rFonts w:ascii="Calibri" w:hAnsi="Calibri" w:eastAsia="Microsoft JhengHei"/>
-                <w:sz w:val="17"/>
-                <w:szCs w:val="17"/>
-              </w:rPr>
-              <w:t xml:space="preserve">一</w:t>
-            </w:r>
-          </w:p>
-        </w:tc>
-        <w:tc>
-          <w:tcPr>
-            <w:tcW w:w="3950" w:type="dxa"/>
-          </w:tcPr>
-          <w:p>
-            <w:pPr>
-              <w:spacing w:after="0"/>
-            </w:pPr>
-            <w:hyperlink r:id="rId31">
-              <w:r>
-                <w:rPr>
-                  <w:rFonts w:ascii="Calibri" w:hAnsi="Calibri" w:eastAsia="Microsoft JhengHei"/>
-                  <w:color w:val="0563C1"/>
-                  <w:sz w:val="17"/>
-                  <w:szCs w:val="17"/>
-                  <w:u w:val="single"/>
-                </w:rPr>
-                <w:t xml:space="preserve">https://doi.org/10.1007/s11747-022-00862-x</w:t>
-              </w:r>
-            </w:hyperlink>
-          </w:p>
-        </w:tc>
-      </w:tr>
-      <w:tr>
-        <w:tc>
-          <w:tcPr>
-            <w:tcW w:w="450" w:type="dxa"/>
-          </w:tcPr>
-          <w:p>
-            <w:pPr>
-              <w:spacing w:after="0"/>
-            </w:pPr>
-            <w:r>
-              <w:rPr>
-                <w:rFonts w:ascii="Calibri" w:hAnsi="Calibri" w:eastAsia="Microsoft JhengHei"/>
-                <w:sz w:val="17"/>
-                <w:szCs w:val="17"/>
-              </w:rPr>
-              <w:t xml:space="preserve">9</w:t>
-            </w:r>
-          </w:p>
-        </w:tc>
-        <w:tc>
-          <w:tcPr>
-            <w:tcW w:w="5900" w:type="dxa"/>
-          </w:tcPr>
-          <w:p>
-            <w:pPr>
-              <w:spacing w:after="0"/>
-            </w:pPr>
-            <w:r>
-              <w:rPr>
-                <w:rFonts w:ascii="Calibri" w:hAnsi="Calibri" w:eastAsia="Microsoft JhengHei"/>
-                <w:sz w:val="17"/>
-                <w:szCs w:val="17"/>
-              </w:rPr>
-              <w:t xml:space="preserve">Kilwinger &amp; van Dam (2021). Methodological considerations on the means-end chain analysis revisited（待核對：頁碼）</w:t>
-            </w:r>
-          </w:p>
-        </w:tc>
-        <w:tc>
-          <w:tcPr>
-            <w:tcW w:w="2700" w:type="dxa"/>
-          </w:tcPr>
-          <w:p>
-            <w:pPr>
-              <w:spacing w:after="0"/>
-            </w:pPr>
-            <w:r>
-              <w:rPr>
-                <w:rFonts w:ascii="Calibri" w:hAnsi="Calibri" w:eastAsia="Microsoft JhengHei"/>
-                <w:sz w:val="17"/>
-                <w:szCs w:val="17"/>
-              </w:rPr>
-              <w:t xml:space="preserve">Psychology &amp; Marketing（B 級）</w:t>
-            </w:r>
-          </w:p>
-        </w:tc>
-        <w:tc>
-          <w:tcPr>
-            <w:tcW w:w="800" w:type="dxa"/>
-          </w:tcPr>
-          <w:p>
-            <w:pPr>
-              <w:spacing w:after="0"/>
-            </w:pPr>
-            <w:r>
-              <w:rPr>
-                <w:rFonts w:ascii="Calibri" w:hAnsi="Calibri" w:eastAsia="Microsoft JhengHei"/>
-                <w:sz w:val="17"/>
-                <w:szCs w:val="17"/>
-              </w:rPr>
-              <w:t xml:space="preserve">一</w:t>
-            </w:r>
-          </w:p>
-        </w:tc>
-        <w:tc>
-          <w:tcPr>
-            <w:tcW w:w="3950" w:type="dxa"/>
-          </w:tcPr>
-          <w:p>
-            <w:pPr>
-              <w:spacing w:after="0"/>
-            </w:pPr>
-            <w:hyperlink r:id="rId32">
-              <w:r>
-                <w:rPr>
-                  <w:rFonts w:ascii="Calibri" w:hAnsi="Calibri" w:eastAsia="Microsoft JhengHei"/>
-                  <w:color w:val="0563C1"/>
-                  <w:sz w:val="17"/>
-                  <w:szCs w:val="17"/>
-                  <w:u w:val="single"/>
-                </w:rPr>
-                <w:t xml:space="preserve">https://doi.org/10.1002/mar.21521</w:t>
-              </w:r>
-            </w:hyperlink>
-          </w:p>
-        </w:tc>
-      </w:tr>
-      <w:tr>
-        <w:tc>
-          <w:tcPr>
-            <w:tcW w:w="450" w:type="dxa"/>
-          </w:tcPr>
-          <w:p>
-            <w:pPr>
-              <w:spacing w:after="0"/>
-            </w:pPr>
-            <w:r>
-              <w:rPr>
-                <w:rFonts w:ascii="Calibri" w:hAnsi="Calibri" w:eastAsia="Microsoft JhengHei"/>
-                <w:sz w:val="17"/>
-                <w:szCs w:val="17"/>
-              </w:rPr>
-              <w:t xml:space="preserve">10</w:t>
-            </w:r>
-          </w:p>
-        </w:tc>
-        <w:tc>
-          <w:tcPr>
-            <w:tcW w:w="5900" w:type="dxa"/>
-          </w:tcPr>
-          <w:p>
-            <w:pPr>
-              <w:spacing w:after="0"/>
-            </w:pPr>
-            <w:r>
-              <w:rPr>
-                <w:rFonts w:ascii="Calibri" w:hAnsi="Calibri" w:eastAsia="Microsoft JhengHei"/>
-                <w:sz w:val="17"/>
-                <w:szCs w:val="17"/>
-              </w:rPr>
-              <w:t xml:space="preserve">Tsiros &amp; Mittal (2000). Regret: A model of its antecedents and consequences in consumer decision making</w:t>
-            </w:r>
-          </w:p>
-        </w:tc>
-        <w:tc>
-          <w:tcPr>
-            <w:tcW w:w="2700" w:type="dxa"/>
-          </w:tcPr>
-          <w:p>
-            <w:pPr>
-              <w:spacing w:after="0"/>
-            </w:pPr>
-            <w:r>
-              <w:rPr>
-                <w:rFonts w:ascii="Calibri" w:hAnsi="Calibri" w:eastAsia="Microsoft JhengHei"/>
-                <w:sz w:val="17"/>
-                <w:szCs w:val="17"/>
-              </w:rPr>
-              <w:t xml:space="preserve">Journal of Consumer Research（理論基礎）</w:t>
-            </w:r>
-          </w:p>
-        </w:tc>
-        <w:tc>
-          <w:tcPr>
-            <w:tcW w:w="800" w:type="dxa"/>
-          </w:tcPr>
-          <w:p>
-            <w:pPr>
-              <w:spacing w:after="0"/>
-            </w:pPr>
-            <w:r>
-              <w:rPr>
-                <w:rFonts w:ascii="Calibri" w:hAnsi="Calibri" w:eastAsia="Microsoft JhengHei"/>
-                <w:sz w:val="17"/>
-                <w:szCs w:val="17"/>
-              </w:rPr>
-              <w:t xml:space="preserve">二</w:t>
-            </w:r>
-          </w:p>
-        </w:tc>
-        <w:tc>
-          <w:tcPr>
-            <w:tcW w:w="3950" w:type="dxa"/>
-          </w:tcPr>
-          <w:p>
-            <w:pPr>
-              <w:spacing w:after="0"/>
-            </w:pPr>
-            <w:hyperlink r:id="rId33">
-              <w:r>
-                <w:rPr>
-                  <w:rFonts w:ascii="Calibri" w:hAnsi="Calibri" w:eastAsia="Microsoft JhengHei"/>
-                  <w:color w:val="0563C1"/>
-                  <w:sz w:val="17"/>
-                  <w:szCs w:val="17"/>
-                  <w:u w:val="single"/>
-                </w:rPr>
-                <w:t xml:space="preserve">https://doi.org/10.1086/209571</w:t>
-              </w:r>
-            </w:hyperlink>
-          </w:p>
-        </w:tc>
-      </w:tr>
-      <w:tr>
-        <w:tc>
-          <w:tcPr>
-            <w:tcW w:w="450" w:type="dxa"/>
-          </w:tcPr>
-          <w:p>
-            <w:pPr>
-              <w:spacing w:after="0"/>
-            </w:pPr>
-            <w:r>
-              <w:rPr>
-                <w:rFonts w:ascii="Calibri" w:hAnsi="Calibri" w:eastAsia="Microsoft JhengHei"/>
-                <w:sz w:val="17"/>
-                <w:szCs w:val="17"/>
-              </w:rPr>
-              <w:t xml:space="preserve">11</w:t>
-            </w:r>
-          </w:p>
-        </w:tc>
-        <w:tc>
-          <w:tcPr>
-            <w:tcW w:w="5900" w:type="dxa"/>
-          </w:tcPr>
-          <w:p>
-            <w:pPr>
-              <w:spacing w:after="0"/>
-            </w:pPr>
-            <w:r>
-              <w:rPr>
-                <w:rFonts w:ascii="Calibri" w:hAnsi="Calibri" w:eastAsia="Microsoft JhengHei"/>
-                <w:sz w:val="17"/>
-                <w:szCs w:val="17"/>
-              </w:rPr>
-              <w:t xml:space="preserve">Oliver (1980). A cognitive model of the antecedents and consequences of satisfaction decisions</w:t>
-            </w:r>
-          </w:p>
-        </w:tc>
-        <w:tc>
-          <w:tcPr>
-            <w:tcW w:w="2700" w:type="dxa"/>
-          </w:tcPr>
-          <w:p>
-            <w:pPr>
-              <w:spacing w:after="0"/>
-            </w:pPr>
-            <w:r>
-              <w:rPr>
-                <w:rFonts w:ascii="Calibri" w:hAnsi="Calibri" w:eastAsia="Microsoft JhengHei"/>
-                <w:sz w:val="17"/>
-                <w:szCs w:val="17"/>
-              </w:rPr>
-              <w:t xml:space="preserve">Journal of Marketing Research（理論基礎）</w:t>
-            </w:r>
-          </w:p>
-        </w:tc>
-        <w:tc>
-          <w:tcPr>
-            <w:tcW w:w="800" w:type="dxa"/>
-          </w:tcPr>
-          <w:p>
-            <w:pPr>
-              <w:spacing w:after="0"/>
-            </w:pPr>
-            <w:r>
-              <w:rPr>
-                <w:rFonts w:ascii="Calibri" w:hAnsi="Calibri" w:eastAsia="Microsoft JhengHei"/>
-                <w:sz w:val="17"/>
-                <w:szCs w:val="17"/>
-              </w:rPr>
-              <w:t xml:space="preserve">三</w:t>
-            </w:r>
-          </w:p>
-        </w:tc>
-        <w:tc>
-          <w:tcPr>
-            <w:tcW w:w="3950" w:type="dxa"/>
-          </w:tcPr>
-          <w:p>
-            <w:pPr>
-              <w:spacing w:after="0"/>
-            </w:pPr>
-            <w:hyperlink r:id="rId34">
+            <w:hyperlink r:id="rId20">
               <w:r>
                 <w:rPr>
                   <w:rFonts w:ascii="Calibri" w:hAnsi="Calibri" w:eastAsia="Microsoft JhengHei"/>
@@ -1252,7 +580,7 @@
                 <w:sz w:val="17"/>
                 <w:szCs w:val="17"/>
               </w:rPr>
-              <w:t xml:space="preserve">12</w:t>
+              <w:t xml:space="preserve">5</w:t>
             </w:r>
           </w:p>
         </w:tc>
@@ -1318,7 +646,7 @@
             <w:pPr>
               <w:spacing w:after="0"/>
             </w:pPr>
-            <w:hyperlink r:id="rId35">
+            <w:hyperlink r:id="rId21">
               <w:r>
                 <w:rPr>
                   <w:rFonts w:ascii="Calibri" w:hAnsi="Calibri" w:eastAsia="Microsoft JhengHei"/>
@@ -1348,7 +676,7 @@
                 <w:sz w:val="17"/>
                 <w:szCs w:val="17"/>
               </w:rPr>
-              <w:t xml:space="preserve">13</w:t>
+              <w:t xml:space="preserve">6</w:t>
             </w:r>
           </w:p>
         </w:tc>
@@ -1414,7 +742,7 @@
             <w:pPr>
               <w:spacing w:after="0"/>
             </w:pPr>
-            <w:hyperlink r:id="rId36">
+            <w:hyperlink r:id="rId22">
               <w:r>
                 <w:rPr>
                   <w:rFonts w:ascii="Calibri" w:hAnsi="Calibri" w:eastAsia="Microsoft JhengHei"/>
@@ -1662,7 +990,7 @@
             <w:pPr>
               <w:spacing w:after="0"/>
             </w:pPr>
-            <w:hyperlink r:id="rId37">
+            <w:hyperlink r:id="rId23">
               <w:r>
                 <w:rPr>
                   <w:rFonts w:ascii="Calibri" w:hAnsi="Calibri" w:eastAsia="Microsoft JhengHei"/>
@@ -1702,7 +1030,7 @@
           <w:sz w:val="26"/>
           <w:szCs w:val="26"/>
         </w:rPr>
-        <w:t xml:space="preserve">二、系統性文獻回顧：保留候選、尚未下載（3 篇）</w:t>
+        <w:t xml:space="preserve">二、系統性文獻回顧：保留候選、尚未下載（0 篇）</w:t>
       </w:r>
     </w:p>
     <w:p>
@@ -1715,7 +1043,7 @@
           <w:sz w:val="21"/>
           <w:szCs w:val="21"/>
         </w:rPr>
-        <w:t xml:space="preserve">以下文獻與主題相關，計畫書未引用，建議下載以供正式回顧時全文篩選。另有 13 篇保留候選已下載並歸檔（見第四節）。</w:t>
+        <w:t xml:space="preserve">以下文獻與主題相關，計畫書未引用，建議下載以供正式回顧時全文篩選。另有 16 篇保留候選已下載並歸檔（見第四節）。</w:t>
       </w:r>
     </w:p>
     <w:tbl>
@@ -1819,240 +1147,6 @@
               </w:rPr>
               <w:t xml:space="preserve">連結</w:t>
             </w:r>
-          </w:p>
-        </w:tc>
-      </w:tr>
-      <w:tr>
-        <w:tc>
-          <w:tcPr>
-            <w:tcW w:w="450" w:type="dxa"/>
-          </w:tcPr>
-          <w:p>
-            <w:pPr>
-              <w:spacing w:after="0"/>
-            </w:pPr>
-            <w:r>
-              <w:rPr>
-                <w:rFonts w:ascii="Calibri" w:hAnsi="Calibri" w:eastAsia="Microsoft JhengHei"/>
-                <w:sz w:val="17"/>
-                <w:szCs w:val="17"/>
-              </w:rPr>
-              <w:t xml:space="preserve">1</w:t>
-            </w:r>
-          </w:p>
-        </w:tc>
-        <w:tc>
-          <w:tcPr>
-            <w:tcW w:w="6300" w:type="dxa"/>
-          </w:tcPr>
-          <w:p>
-            <w:pPr>
-              <w:spacing w:after="0"/>
-            </w:pPr>
-            <w:r>
-              <w:rPr>
-                <w:rFonts w:ascii="Calibri" w:hAnsi="Calibri" w:eastAsia="Microsoft JhengHei"/>
-                <w:sz w:val="17"/>
-                <w:szCs w:val="17"/>
-              </w:rPr>
-              <w:t xml:space="preserve">Expectancy violations and discontinuance behavior in live-streaming commerce: Exploring human interactions with virtual streamers（PMC 收錄）</w:t>
-            </w:r>
-          </w:p>
-        </w:tc>
-        <w:tc>
-          <w:tcPr>
-            <w:tcW w:w="2600" w:type="dxa"/>
-          </w:tcPr>
-          <w:p>
-            <w:pPr>
-              <w:spacing w:after="0"/>
-            </w:pPr>
-            <w:r>
-              <w:rPr>
-                <w:rFonts w:ascii="Calibri" w:hAnsi="Calibri" w:eastAsia="Microsoft JhengHei"/>
-                <w:sz w:val="17"/>
-                <w:szCs w:val="17"/>
-              </w:rPr>
-              <w:t xml:space="preserve">相關，期刊等級待確認</w:t>
-            </w:r>
-          </w:p>
-        </w:tc>
-        <w:tc>
-          <w:tcPr>
-            <w:tcW w:w="4450" w:type="dxa"/>
-          </w:tcPr>
-          <w:p>
-            <w:pPr>
-              <w:spacing w:after="0"/>
-            </w:pPr>
-            <w:hyperlink r:id="rId38">
-              <w:r>
-                <w:rPr>
-                  <w:rFonts w:ascii="Calibri" w:hAnsi="Calibri" w:eastAsia="Microsoft JhengHei"/>
-                  <w:color w:val="0563C1"/>
-                  <w:sz w:val="17"/>
-                  <w:szCs w:val="17"/>
-                  <w:u w:val="single"/>
-                </w:rPr>
-                <w:t xml:space="preserve">https://www.ncbi.nlm.nih.gov/pmc/articles/PMC11505004/</w:t>
-              </w:r>
-            </w:hyperlink>
-          </w:p>
-        </w:tc>
-      </w:tr>
-      <w:tr>
-        <w:tc>
-          <w:tcPr>
-            <w:tcW w:w="450" w:type="dxa"/>
-          </w:tcPr>
-          <w:p>
-            <w:pPr>
-              <w:spacing w:after="0"/>
-            </w:pPr>
-            <w:r>
-              <w:rPr>
-                <w:rFonts w:ascii="Calibri" w:hAnsi="Calibri" w:eastAsia="Microsoft JhengHei"/>
-                <w:sz w:val="17"/>
-                <w:szCs w:val="17"/>
-              </w:rPr>
-              <w:t xml:space="preserve">2</w:t>
-            </w:r>
-          </w:p>
-        </w:tc>
-        <w:tc>
-          <w:tcPr>
-            <w:tcW w:w="6300" w:type="dxa"/>
-          </w:tcPr>
-          <w:p>
-            <w:pPr>
-              <w:spacing w:after="0"/>
-            </w:pPr>
-            <w:r>
-              <w:rPr>
-                <w:rFonts w:ascii="Calibri" w:hAnsi="Calibri" w:eastAsia="Microsoft JhengHei"/>
-                <w:sz w:val="17"/>
-                <w:szCs w:val="17"/>
-              </w:rPr>
-              <w:t xml:space="preserve">Lu &amp; Li — AI vs. human streamers: How digital agents shape consumer persuasion processing in live-streaming commerce（Journal of Theoretical and Applied Electronic Commerce Research, 21(6), 2026）</w:t>
-            </w:r>
-          </w:p>
-        </w:tc>
-        <w:tc>
-          <w:tcPr>
-            <w:tcW w:w="2600" w:type="dxa"/>
-          </w:tcPr>
-          <w:p>
-            <w:pPr>
-              <w:spacing w:after="0"/>
-            </w:pPr>
-            <w:r>
-              <w:rPr>
-                <w:rFonts w:ascii="Calibri" w:hAnsi="Calibri" w:eastAsia="Microsoft JhengHei"/>
-                <w:sz w:val="17"/>
-                <w:szCs w:val="17"/>
-              </w:rPr>
-              <w:t xml:space="preserve">與第二階段說服知識假說直接相關，待全文篩選</w:t>
-            </w:r>
-          </w:p>
-        </w:tc>
-        <w:tc>
-          <w:tcPr>
-            <w:tcW w:w="4450" w:type="dxa"/>
-          </w:tcPr>
-          <w:p>
-            <w:pPr>
-              <w:spacing w:after="0"/>
-            </w:pPr>
-            <w:hyperlink r:id="rId39">
-              <w:r>
-                <w:rPr>
-                  <w:rFonts w:ascii="Calibri" w:hAnsi="Calibri" w:eastAsia="Microsoft JhengHei"/>
-                  <w:color w:val="0563C1"/>
-                  <w:sz w:val="17"/>
-                  <w:szCs w:val="17"/>
-                  <w:u w:val="single"/>
-                </w:rPr>
-                <w:t xml:space="preserve">https://www.citedrive.com/en/discovery/ai-vs-human-streamers-how-digital-agents-shape-consumer-persuasion-processing-in-live-streaming-commerce/</w:t>
-              </w:r>
-            </w:hyperlink>
-          </w:p>
-        </w:tc>
-      </w:tr>
-      <w:tr>
-        <w:tc>
-          <w:tcPr>
-            <w:tcW w:w="450" w:type="dxa"/>
-          </w:tcPr>
-          <w:p>
-            <w:pPr>
-              <w:spacing w:after="0"/>
-            </w:pPr>
-            <w:r>
-              <w:rPr>
-                <w:rFonts w:ascii="Calibri" w:hAnsi="Calibri" w:eastAsia="Microsoft JhengHei"/>
-                <w:sz w:val="17"/>
-                <w:szCs w:val="17"/>
-              </w:rPr>
-              <w:t xml:space="preserve">3</w:t>
-            </w:r>
-          </w:p>
-        </w:tc>
-        <w:tc>
-          <w:tcPr>
-            <w:tcW w:w="6300" w:type="dxa"/>
-          </w:tcPr>
-          <w:p>
-            <w:pPr>
-              <w:spacing w:after="0"/>
-            </w:pPr>
-            <w:r>
-              <w:rPr>
-                <w:rFonts w:ascii="Calibri" w:hAnsi="Calibri" w:eastAsia="Microsoft JhengHei"/>
-                <w:sz w:val="17"/>
-                <w:szCs w:val="17"/>
-              </w:rPr>
-              <w:t xml:space="preserve">Zhou &amp; Li — Virtual AI streaming, trust, flow and impulsive purchase（Journal of Theoretical and Applied Electronic Commerce Research, 20(3), 204, 2025）</w:t>
-            </w:r>
-          </w:p>
-        </w:tc>
-        <w:tc>
-          <w:tcPr>
-            <w:tcW w:w="2600" w:type="dxa"/>
-          </w:tcPr>
-          <w:p>
-            <w:pPr>
-              <w:spacing w:after="0"/>
-            </w:pPr>
-            <w:r>
-              <w:rPr>
-                <w:rFonts w:ascii="Calibri" w:hAnsi="Calibri" w:eastAsia="Microsoft JhengHei"/>
-                <w:sz w:val="17"/>
-                <w:szCs w:val="17"/>
-              </w:rPr>
-              <w:t xml:space="preserve">相關，待全文篩選</w:t>
-            </w:r>
-          </w:p>
-        </w:tc>
-        <w:tc>
-          <w:tcPr>
-            <w:tcW w:w="4450" w:type="dxa"/>
-          </w:tcPr>
-          <w:p>
-            <w:pPr>
-              <w:spacing w:after="0"/>
-            </w:pPr>
-            <w:hyperlink r:id="rId40">
-              <w:r>
-                <w:rPr>
-                  <w:rFonts w:ascii="Calibri" w:hAnsi="Calibri" w:eastAsia="Microsoft JhengHei"/>
-                  <w:color w:val="0563C1"/>
-                  <w:sz w:val="17"/>
-                  <w:szCs w:val="17"/>
-                  <w:u w:val="single"/>
-                </w:rPr>
-                <w:t xml:space="preserve">https://www.mdpi.com/0718-1876/20/3/204</w:t>
-              </w:r>
-            </w:hyperlink>
           </w:p>
         </w:tc>
       </w:tr>
@@ -3253,7 +2347,7 @@
           <w:sz w:val="26"/>
           <w:szCs w:val="26"/>
         </w:rPr>
-        <w:t xml:space="preserve">四、系統性文獻回顧：保留候選、已下載並歸檔（13 篇）</w:t>
+        <w:t xml:space="preserve">四、系統性文獻回顧：保留候選、已下載並歸檔（16 篇）</w:t>
       </w:r>
     </w:p>
     <w:p>
@@ -3494,6 +2588,62 @@
                 <w:sz w:val="17"/>
                 <w:szCs w:val="17"/>
               </w:rPr>
+              <w:t xml:space="preserve">Chen &amp; Li — Expectancy violations and discontinuance behavior in live-streaming commerce: Exploring human interactions with virtual streamers（Behavioral Sciences, 14, 920, 2024）</w:t>
+            </w:r>
+          </w:p>
+        </w:tc>
+        <w:tc>
+          <w:tcPr>
+            <w:tcW w:w="3750" w:type="dxa"/>
+          </w:tcPr>
+          <w:p>
+            <w:pPr>
+              <w:spacing w:after="0"/>
+            </w:pPr>
+            <w:r>
+              <w:rPr>
+                <w:rFonts w:ascii="Calibri" w:hAnsi="Calibri" w:eastAsia="Microsoft JhengHei"/>
+                <w:sz w:val="17"/>
+                <w:szCs w:val="17"/>
+              </w:rPr>
+              <w:t xml:space="preserve">1. 主題一 創新發展</w:t>
+            </w:r>
+          </w:p>
+        </w:tc>
+      </w:tr>
+      <w:tr>
+        <w:tc>
+          <w:tcPr>
+            <w:tcW w:w="450" w:type="dxa"/>
+          </w:tcPr>
+          <w:p>
+            <w:pPr>
+              <w:spacing w:after="0"/>
+            </w:pPr>
+            <w:r>
+              <w:rPr>
+                <w:rFonts w:ascii="Calibri" w:hAnsi="Calibri" w:eastAsia="Microsoft JhengHei"/>
+                <w:sz w:val="17"/>
+                <w:szCs w:val="17"/>
+              </w:rPr>
+              <w:t xml:space="preserve">4</w:t>
+            </w:r>
+          </w:p>
+        </w:tc>
+        <w:tc>
+          <w:tcPr>
+            <w:tcW w:w="9600" w:type="dxa"/>
+          </w:tcPr>
+          <w:p>
+            <w:pPr>
+              <w:spacing w:after="0"/>
+            </w:pPr>
+            <w:r>
+              <w:rPr>
+                <w:rFonts w:ascii="Calibri" w:hAnsi="Calibri" w:eastAsia="Microsoft JhengHei"/>
+                <w:sz w:val="17"/>
+                <w:szCs w:val="17"/>
+              </w:rPr>
               <w:t xml:space="preserve">Ji — Influence of virtual live streamers' credibility on online sales performance（SAGE Open, 2024）</w:t>
             </w:r>
           </w:p>
@@ -3532,7 +2682,7 @@
                 <w:sz w:val="17"/>
                 <w:szCs w:val="17"/>
               </w:rPr>
-              <w:t xml:space="preserve">4</w:t>
+              <w:t xml:space="preserve">5</w:t>
             </w:r>
           </w:p>
         </w:tc>
@@ -3550,6 +2700,118 @@
                 <w:sz w:val="17"/>
                 <w:szCs w:val="17"/>
               </w:rPr>
+              <w:t xml:space="preserve">Lu &amp; Li — AI vs. human streamers: How digital agents shape consumer persuasion processing in live streaming commerce（Journal of Theoretical and Applied Electronic Commerce Research, 21, 195, 2026）</w:t>
+            </w:r>
+          </w:p>
+        </w:tc>
+        <w:tc>
+          <w:tcPr>
+            <w:tcW w:w="3750" w:type="dxa"/>
+          </w:tcPr>
+          <w:p>
+            <w:pPr>
+              <w:spacing w:after="0"/>
+            </w:pPr>
+            <w:r>
+              <w:rPr>
+                <w:rFonts w:ascii="Calibri" w:hAnsi="Calibri" w:eastAsia="Microsoft JhengHei"/>
+                <w:sz w:val="17"/>
+                <w:szCs w:val="17"/>
+              </w:rPr>
+              <w:t xml:space="preserve">1. 主題一 創新發展</w:t>
+            </w:r>
+          </w:p>
+        </w:tc>
+      </w:tr>
+      <w:tr>
+        <w:tc>
+          <w:tcPr>
+            <w:tcW w:w="450" w:type="dxa"/>
+          </w:tcPr>
+          <w:p>
+            <w:pPr>
+              <w:spacing w:after="0"/>
+            </w:pPr>
+            <w:r>
+              <w:rPr>
+                <w:rFonts w:ascii="Calibri" w:hAnsi="Calibri" w:eastAsia="Microsoft JhengHei"/>
+                <w:sz w:val="17"/>
+                <w:szCs w:val="17"/>
+              </w:rPr>
+              <w:t xml:space="preserve">6</w:t>
+            </w:r>
+          </w:p>
+        </w:tc>
+        <w:tc>
+          <w:tcPr>
+            <w:tcW w:w="9600" w:type="dxa"/>
+          </w:tcPr>
+          <w:p>
+            <w:pPr>
+              <w:spacing w:after="0"/>
+            </w:pPr>
+            <w:r>
+              <w:rPr>
+                <w:rFonts w:ascii="Calibri" w:hAnsi="Calibri" w:eastAsia="Microsoft JhengHei"/>
+                <w:sz w:val="17"/>
+                <w:szCs w:val="17"/>
+              </w:rPr>
+              <w:t xml:space="preserve">Zhou &amp; Li — Examining consumer impulsive purchase intention in virtual AI streaming: A S-O-R perspective（Journal of Theoretical and Applied Electronic Commerce Research, 20, 204, 2025）</w:t>
+            </w:r>
+          </w:p>
+        </w:tc>
+        <w:tc>
+          <w:tcPr>
+            <w:tcW w:w="3750" w:type="dxa"/>
+          </w:tcPr>
+          <w:p>
+            <w:pPr>
+              <w:spacing w:after="0"/>
+            </w:pPr>
+            <w:r>
+              <w:rPr>
+                <w:rFonts w:ascii="Calibri" w:hAnsi="Calibri" w:eastAsia="Microsoft JhengHei"/>
+                <w:sz w:val="17"/>
+                <w:szCs w:val="17"/>
+              </w:rPr>
+              <w:t xml:space="preserve">1. 主題一 創新發展</w:t>
+            </w:r>
+          </w:p>
+        </w:tc>
+      </w:tr>
+      <w:tr>
+        <w:tc>
+          <w:tcPr>
+            <w:tcW w:w="450" w:type="dxa"/>
+          </w:tcPr>
+          <w:p>
+            <w:pPr>
+              <w:spacing w:after="0"/>
+            </w:pPr>
+            <w:r>
+              <w:rPr>
+                <w:rFonts w:ascii="Calibri" w:hAnsi="Calibri" w:eastAsia="Microsoft JhengHei"/>
+                <w:sz w:val="17"/>
+                <w:szCs w:val="17"/>
+              </w:rPr>
+              <w:t xml:space="preserve">7</w:t>
+            </w:r>
+          </w:p>
+        </w:tc>
+        <w:tc>
+          <w:tcPr>
+            <w:tcW w:w="9600" w:type="dxa"/>
+          </w:tcPr>
+          <w:p>
+            <w:pPr>
+              <w:spacing w:after="0"/>
+            </w:pPr>
+            <w:r>
+              <w:rPr>
+                <w:rFonts w:ascii="Calibri" w:hAnsi="Calibri" w:eastAsia="Microsoft JhengHei"/>
+                <w:sz w:val="17"/>
+                <w:szCs w:val="17"/>
+              </w:rPr>
               <w:t xml:space="preserve">Zheng, Wang, Dou &amp; Ling — The marketing effects of live streaming in online marketplaces（Information &amp; Management, 63, 104288, 2026）</w:t>
             </w:r>
           </w:p>
@@ -3588,7 +2850,7 @@
                 <w:sz w:val="17"/>
                 <w:szCs w:val="17"/>
               </w:rPr>
-              <w:t xml:space="preserve">5</w:t>
+              <w:t xml:space="preserve">8</w:t>
             </w:r>
           </w:p>
         </w:tc>
@@ -3644,7 +2906,7 @@
                 <w:sz w:val="17"/>
                 <w:szCs w:val="17"/>
               </w:rPr>
-              <w:t xml:space="preserve">6</w:t>
+              <w:t xml:space="preserve">9</w:t>
             </w:r>
           </w:p>
         </w:tc>
@@ -3700,7 +2962,7 @@
                 <w:sz w:val="17"/>
                 <w:szCs w:val="17"/>
               </w:rPr>
-              <w:t xml:space="preserve">7</w:t>
+              <w:t xml:space="preserve">10</w:t>
             </w:r>
           </w:p>
         </w:tc>
@@ -3756,7 +3018,7 @@
                 <w:sz w:val="17"/>
                 <w:szCs w:val="17"/>
               </w:rPr>
-              <w:t xml:space="preserve">8</w:t>
+              <w:t xml:space="preserve">11</w:t>
             </w:r>
           </w:p>
         </w:tc>
@@ -3812,7 +3074,7 @@
                 <w:sz w:val="17"/>
                 <w:szCs w:val="17"/>
               </w:rPr>
-              <w:t xml:space="preserve">9</w:t>
+              <w:t xml:space="preserve">12</w:t>
             </w:r>
           </w:p>
         </w:tc>
@@ -3868,7 +3130,7 @@
                 <w:sz w:val="17"/>
                 <w:szCs w:val="17"/>
               </w:rPr>
-              <w:t xml:space="preserve">10</w:t>
+              <w:t xml:space="preserve">13</w:t>
             </w:r>
           </w:p>
         </w:tc>
@@ -3924,7 +3186,7 @@
                 <w:sz w:val="17"/>
                 <w:szCs w:val="17"/>
               </w:rPr>
-              <w:t xml:space="preserve">11</w:t>
+              <w:t xml:space="preserve">14</w:t>
             </w:r>
           </w:p>
         </w:tc>
@@ -3980,7 +3242,7 @@
                 <w:sz w:val="17"/>
                 <w:szCs w:val="17"/>
               </w:rPr>
-              <w:t xml:space="preserve">12</w:t>
+              <w:t xml:space="preserve">15</w:t>
             </w:r>
           </w:p>
         </w:tc>
@@ -4036,7 +3298,7 @@
                 <w:sz w:val="17"/>
                 <w:szCs w:val="17"/>
               </w:rPr>
-              <w:t xml:space="preserve">13</w:t>
+              <w:t xml:space="preserve">16</w:t>
             </w:r>
           </w:p>
         </w:tc>

</xml_diff>